<commit_message>
feat(template): 更新 UK 模板
</commit_message>
<xml_diff>
--- a/services/doc-service/templates/OVERSEA_WALKERS_GB.docx
+++ b/services/doc-service/templates/OVERSEA_WALKERS_GB.docx
@@ -1,6 +1,6 @@
 
 <file path=word/document.xml><?xml version="1.0" encoding="utf-8"?>
-<w:document xmlns:wpc="http://schemas.microsoft.com/office/word/2010/wordprocessingCanvas" xmlns:mc="http://schemas.openxmlformats.org/markup-compatibility/2006" xmlns:o="urn:schemas-microsoft-com:office:office" xmlns:r="http://schemas.openxmlformats.org/officeDocument/2006/relationships" xmlns:m="http://schemas.openxmlformats.org/officeDocument/2006/math" xmlns:v="urn:schemas-microsoft-com:vml" xmlns:wp14="http://schemas.microsoft.com/office/word/2010/wordprocessingDrawing" xmlns:wp="http://schemas.openxmlformats.org/drawingml/2006/wordprocessingDrawing" xmlns:w="http://schemas.openxmlformats.org/wordprocessingml/2006/main" xmlns:w14="http://schemas.microsoft.com/office/word/2010/wordml" xmlns:w10="urn:schemas-microsoft-com:office:word" xmlns:w15="http://schemas.microsoft.com/office/word/2012/wordml" xmlns:wpg="http://schemas.microsoft.com/office/word/2010/wordprocessingGroup" xmlns:wpi="http://schemas.microsoft.com/office/word/2010/wordprocessingInk" xmlns:wne="http://schemas.microsoft.com/office/word/2006/wordml" xmlns:wps="http://schemas.microsoft.com/office/word/2010/wordprocessingShape" xmlns:wpsCustomData="http://www.wps.cn/officeDocument/2013/wpsCustomData" mc:Ignorable="w14 w15 wp14">
+<w:document xmlns:wpc="http://schemas.microsoft.com/office/word/2010/wordprocessingCanvas" xmlns:cx="http://schemas.microsoft.com/office/drawing/2014/chartex" xmlns:cx1="http://schemas.microsoft.com/office/drawing/2015/9/8/chartex" xmlns:cx2="http://schemas.microsoft.com/office/drawing/2015/10/21/chartex" xmlns:cx3="http://schemas.microsoft.com/office/drawing/2016/5/9/chartex" xmlns:cx4="http://schemas.microsoft.com/office/drawing/2016/5/10/chartex" xmlns:cx5="http://schemas.microsoft.com/office/drawing/2016/5/11/chartex" xmlns:cx6="http://schemas.microsoft.com/office/drawing/2016/5/12/chartex" xmlns:cx7="http://schemas.microsoft.com/office/drawing/2016/5/13/chartex" xmlns:cx8="http://schemas.microsoft.com/office/drawing/2016/5/14/chartex" xmlns:mc="http://schemas.openxmlformats.org/markup-compatibility/2006" xmlns:o="urn:schemas-microsoft-com:office:office" xmlns:r="http://schemas.openxmlformats.org/officeDocument/2006/relationships" xmlns:m="http://schemas.openxmlformats.org/officeDocument/2006/math" xmlns:v="urn:schemas-microsoft-com:vml" xmlns:wp14="http://schemas.microsoft.com/office/word/2010/wordprocessingDrawing" xmlns:wp="http://schemas.openxmlformats.org/drawingml/2006/wordprocessingDrawing" xmlns:w="http://schemas.openxmlformats.org/wordprocessingml/2006/main" xmlns:w14="http://schemas.microsoft.com/office/word/2010/wordml" xmlns:w10="urn:schemas-microsoft-com:office:word" xmlns:w15="http://schemas.microsoft.com/office/word/2012/wordml" xmlns:wpg="http://schemas.microsoft.com/office/word/2010/wordprocessingGroup" xmlns:wpi="http://schemas.microsoft.com/office/word/2010/wordprocessingInk" xmlns:wne="http://schemas.microsoft.com/office/word/2006/wordml" xmlns:wps="http://schemas.microsoft.com/office/word/2010/wordprocessingShape" xmlns:wpsCustomData="http://www.wps.cn/officeDocument/2013/wpsCustomData" mc:Ignorable="w14 w15 wp14">
   <w:body>
     <w:p>
       <w:pPr>
@@ -89,13 +89,6 @@
         </w:rPr>
         <w:t>{{ agreement_number }}</w:t>
       </w:r>
-      <w:r>
-        <w:rPr>
-          <w:spacing w:val="-1"/>
-          <w:sz w:val="18"/>
-          <w:szCs w:val="18"/>
-        </w:rPr>
-      </w:r>
     </w:p>
     <w:p>
       <w:pPr>
@@ -124,57 +117,7 @@
           <w:szCs w:val="19"/>
           <w:lang w:val="en-US" w:eastAsia="en-US" w:bidi="ar-SA"/>
         </w:rPr>
-        <w:t>This agreement will be valid from</w:t>
-      </w:r>
-      <w:r>
-        <w:rPr>
-          <w:rFonts w:hint="eastAsia" w:ascii="Times New Roman" w:hAnsi="Times New Roman" w:eastAsia="Times New Roman" w:cs="Times New Roman"/>
-          <w:snapToGrid w:val="0"/>
-          <w:color w:val="000000"/>
-          <w:spacing w:val="5"/>
-          <w:kern w:val="0"/>
-          <w:sz w:val="19"/>
-          <w:szCs w:val="19"/>
-          <w:lang w:val="en-US" w:eastAsia="en-US" w:bidi="ar-SA"/>
-        </w:rPr>
-        <w:t xml:space="preserve"> {{ effective_range_en }}</w:t>
-      </w:r>
-      <w:r>
-        <w:rPr>
-          <w:rFonts w:hint="eastAsia" w:ascii="Times New Roman" w:hAnsi="Times New Roman" w:eastAsia="Times New Roman" w:cs="Times New Roman"/>
-          <w:snapToGrid w:val="0"/>
-          <w:color w:val="000000"/>
-          <w:spacing w:val="5"/>
-          <w:kern w:val="0"/>
-          <w:sz w:val="19"/>
-          <w:szCs w:val="19"/>
-          <w:lang w:val="en-US" w:eastAsia="en-US" w:bidi="ar-SA"/>
-        </w:rPr>
-      </w:r>
-      <w:r>
-        <w:rPr>
-          <w:rFonts w:hint="eastAsia" w:ascii="Times New Roman" w:hAnsi="Times New Roman" w:eastAsia="Times New Roman" w:cs="Times New Roman"/>
-          <w:snapToGrid w:val="0"/>
-          <w:color w:val="000000"/>
-          <w:spacing w:val="5"/>
-          <w:kern w:val="0"/>
-          <w:sz w:val="19"/>
-          <w:szCs w:val="19"/>
-          <w:lang w:val="en-US" w:eastAsia="en-US" w:bidi="ar-SA"/>
-        </w:rPr>
-      </w:r>
-      <w:r>
-        <w:rPr>
-          <w:rFonts w:hint="eastAsia" w:ascii="Times New Roman" w:hAnsi="Times New Roman" w:eastAsia="Times New Roman" w:cs="Times New Roman"/>
-          <w:snapToGrid w:val="0"/>
-          <w:color w:val="000000"/>
-          <w:spacing w:val="5"/>
-          <w:kern w:val="0"/>
-          <w:sz w:val="19"/>
-          <w:szCs w:val="19"/>
-          <w:lang w:val="en-US" w:eastAsia="en-US" w:bidi="ar-SA"/>
-        </w:rPr>
-        <w:t>.</w:t>
+        <w:t>This agreement will be valid from {{ effective_range_en }}.</w:t>
       </w:r>
     </w:p>
     <w:p>
@@ -201,95 +144,7 @@
           <w:rFonts w:hint="eastAsia" w:ascii="宋体" w:hAnsi="宋体" w:eastAsia="宋体" w:cs="宋体"/>
           <w:spacing w:val="3"/>
         </w:rPr>
-        <w:t>此协议有效期自</w:t>
-      </w:r>
-      <w:r>
-        <w:rPr>
-          <w:rFonts w:hint="eastAsia" w:ascii="宋体" w:hAnsi="宋体" w:eastAsia="宋体" w:cs="宋体"/>
-          <w:spacing w:val="3"/>
-        </w:rPr>
-        <w:t>{{ effective_range_cn }}</w:t>
-      </w:r>
-      <w:r>
-        <w:rPr>
-          <w:rFonts w:hint="eastAsia" w:ascii="宋体" w:hAnsi="宋体" w:eastAsia="宋体" w:cs="宋体"/>
-          <w:spacing w:val="3"/>
-        </w:rPr>
-      </w:r>
-      <w:r>
-        <w:rPr>
-          <w:rFonts w:hint="eastAsia" w:ascii="宋体" w:hAnsi="宋体" w:eastAsia="宋体" w:cs="宋体"/>
-          <w:spacing w:val="3"/>
-          <w:lang w:val="en-US" w:eastAsia="zh-CN"/>
-        </w:rPr>
-      </w:r>
-      <w:r>
-        <w:rPr>
-          <w:rFonts w:hint="eastAsia" w:ascii="宋体" w:hAnsi="宋体" w:eastAsia="宋体" w:cs="宋体"/>
-          <w:spacing w:val="3"/>
-        </w:rPr>
-      </w:r>
-      <w:r>
-        <w:rPr>
-          <w:rFonts w:hint="eastAsia" w:ascii="宋体" w:hAnsi="宋体" w:eastAsia="宋体" w:cs="宋体"/>
-          <w:spacing w:val="3"/>
-        </w:rPr>
-      </w:r>
-      <w:r>
-        <w:rPr>
-          <w:rFonts w:hint="eastAsia" w:ascii="宋体" w:hAnsi="宋体" w:eastAsia="宋体" w:cs="宋体"/>
-          <w:spacing w:val="3"/>
-        </w:rPr>
-      </w:r>
-      <w:r>
-        <w:rPr>
-          <w:rFonts w:hint="eastAsia" w:ascii="宋体" w:hAnsi="宋体" w:eastAsia="宋体" w:cs="宋体"/>
-          <w:spacing w:val="3"/>
-        </w:rPr>
-      </w:r>
-      <w:r>
-        <w:rPr>
-          <w:rFonts w:hint="eastAsia" w:ascii="宋体" w:hAnsi="宋体" w:eastAsia="宋体" w:cs="宋体"/>
-          <w:spacing w:val="3"/>
-        </w:rPr>
-      </w:r>
-      <w:r>
-        <w:rPr>
-          <w:rFonts w:hint="eastAsia" w:ascii="宋体" w:hAnsi="宋体" w:eastAsia="宋体" w:cs="宋体"/>
-          <w:spacing w:val="3"/>
-        </w:rPr>
-      </w:r>
-      <w:r>
-        <w:rPr>
-          <w:rFonts w:hint="eastAsia" w:ascii="宋体" w:hAnsi="宋体" w:eastAsia="宋体" w:cs="宋体"/>
-          <w:spacing w:val="3"/>
-          <w:lang w:val="en-US" w:eastAsia="zh-CN"/>
-        </w:rPr>
-      </w:r>
-      <w:r>
-        <w:rPr>
-          <w:rFonts w:hint="eastAsia" w:ascii="宋体" w:hAnsi="宋体" w:eastAsia="宋体" w:cs="宋体"/>
-          <w:spacing w:val="3"/>
-        </w:rPr>
-      </w:r>
-      <w:r>
-        <w:rPr>
-          <w:rFonts w:hint="eastAsia" w:ascii="宋体" w:hAnsi="宋体" w:eastAsia="宋体" w:cs="宋体"/>
-          <w:spacing w:val="3"/>
-        </w:rPr>
-      </w:r>
-      <w:r>
-        <w:rPr>
-          <w:rFonts w:hint="eastAsia" w:ascii="宋体" w:hAnsi="宋体" w:eastAsia="宋体" w:cs="宋体"/>
-          <w:spacing w:val="3"/>
-        </w:rPr>
-      </w:r>
-      <w:r>
-        <w:rPr>
-          <w:rFonts w:hint="eastAsia" w:ascii="宋体" w:hAnsi="宋体" w:eastAsia="宋体" w:cs="宋体"/>
-          <w:spacing w:val="3"/>
-        </w:rPr>
-        <w:t>。到期后由甲方选择续约或合同自动失效。</w:t>
+        <w:t>此协议有效期自{{ effective_range_cn }}。到期后由甲方选择续约或合同自动失效。</w:t>
       </w:r>
     </w:p>
     <w:p>
@@ -625,8 +480,6 @@
               </w:rPr>
               <w:t>英</w:t>
             </w:r>
-            <w:bookmarkStart w:id="0" w:name="_GoBack"/>
-            <w:bookmarkEnd w:id="0"/>
             <w:r>
               <w:rPr>
                 <w:rFonts w:hint="eastAsia" w:eastAsia="宋体"/>
@@ -1251,17 +1104,8 @@
             <w:r>
               <w:rPr>
                 <w:rFonts w:hint="eastAsia"/>
-                <w:color w:val="000000"/>
-                <w:spacing w:val="2"/>
-                <w14:textFill>
-                  <w14:solidFill>
-                    <w14:srgbClr w14:val="000000">
-                      <w14:alpha w14:val="392"/>
-                    </w14:srgbClr>
-                  </w14:solidFill>
-                </w14:textFill>
-              </w:rPr>
-              <w:t>Oversea Walkers,7 Bell Yard, London, WC2A 2JR</w:t>
+              </w:rPr>
+              <w:t>167-169 Great Portland Street, 5th Floor, London, W1W 5PF</w:t>
             </w:r>
           </w:p>
         </w:tc>
@@ -2147,21 +1991,6 @@
                 </w14:textFill>
               </w:rPr>
             </w:pPr>
-            <w:r>
-              <w:rPr>
-                <w:rFonts w:hint="eastAsia"/>
-                <w:color w:val="000000"/>
-                <w:spacing w:val="2"/>
-                <w:lang w:val="en-US" w:eastAsia="zh-CN"/>
-                <w14:textFill>
-                  <w14:solidFill>
-                    <w14:srgbClr w14:val="000000">
-                      <w14:alpha w14:val="392"/>
-                    </w14:srgbClr>
-                  </w14:solidFill>
-                </w14:textFill>
-              </w:rPr>
-            </w:r>
           </w:p>
         </w:tc>
         <w:tc>
@@ -2189,21 +2018,6 @@
                 </w14:textFill>
               </w:rPr>
             </w:pPr>
-            <w:r>
-              <w:rPr>
-                <w:rFonts w:hint="eastAsia"/>
-                <w:color w:val="000000"/>
-                <w:spacing w:val="2"/>
-                <w:lang w:val="en-US" w:eastAsia="zh-CN"/>
-                <w14:textFill>
-                  <w14:solidFill>
-                    <w14:srgbClr w14:val="000000">
-                      <w14:alpha w14:val="392"/>
-                    </w14:srgbClr>
-                  </w14:solidFill>
-                </w14:textFill>
-              </w:rPr>
-            </w:r>
           </w:p>
         </w:tc>
         <w:tc>
@@ -2231,21 +2045,6 @@
                 </w14:textFill>
               </w:rPr>
             </w:pPr>
-            <w:r>
-              <w:rPr>
-                <w:rFonts w:hint="eastAsia"/>
-                <w:color w:val="000000"/>
-                <w:spacing w:val="2"/>
-                <w:lang w:val="en-US" w:eastAsia="zh-CN"/>
-                <w14:textFill>
-                  <w14:solidFill>
-                    <w14:srgbClr w14:val="000000">
-                      <w14:alpha w14:val="392"/>
-                    </w14:srgbClr>
-                  </w14:solidFill>
-                </w14:textFill>
-              </w:rPr>
-            </w:r>
           </w:p>
         </w:tc>
         <w:tc>
@@ -2273,21 +2072,6 @@
                 </w14:textFill>
               </w:rPr>
             </w:pPr>
-            <w:r>
-              <w:rPr>
-                <w:rFonts w:hint="eastAsia"/>
-                <w:color w:val="000000"/>
-                <w:spacing w:val="2"/>
-                <w:lang w:val="en-US" w:eastAsia="zh-CN"/>
-                <w14:textFill>
-                  <w14:solidFill>
-                    <w14:srgbClr w14:val="000000">
-                      <w14:alpha w14:val="392"/>
-                    </w14:srgbClr>
-                  </w14:solidFill>
-                </w14:textFill>
-              </w:rPr>
-            </w:r>
           </w:p>
         </w:tc>
         <w:tc>
@@ -2315,21 +2099,6 @@
                 </w14:textFill>
               </w:rPr>
             </w:pPr>
-            <w:r>
-              <w:rPr>
-                <w:rFonts w:hint="eastAsia"/>
-                <w:color w:val="000000"/>
-                <w:spacing w:val="2"/>
-                <w:lang w:val="en-US" w:eastAsia="zh-CN"/>
-                <w14:textFill>
-                  <w14:solidFill>
-                    <w14:srgbClr w14:val="000000">
-                      <w14:alpha w14:val="392"/>
-                    </w14:srgbClr>
-                  </w14:solidFill>
-                </w14:textFill>
-              </w:rPr>
-            </w:r>
           </w:p>
         </w:tc>
         <w:tc>
@@ -2357,21 +2126,6 @@
                 </w14:textFill>
               </w:rPr>
             </w:pPr>
-            <w:r>
-              <w:rPr>
-                <w:rFonts w:hint="eastAsia"/>
-                <w:color w:val="000000"/>
-                <w:spacing w:val="2"/>
-                <w:lang w:val="en-US" w:eastAsia="zh-CN"/>
-                <w14:textFill>
-                  <w14:solidFill>
-                    <w14:srgbClr w14:val="000000">
-                      <w14:alpha w14:val="392"/>
-                    </w14:srgbClr>
-                  </w14:solidFill>
-                </w14:textFill>
-              </w:rPr>
-            </w:r>
           </w:p>
         </w:tc>
       </w:tr>
@@ -2753,21 +2507,6 @@
                 </w14:textFill>
               </w:rPr>
             </w:pPr>
-            <w:r>
-              <w:rPr>
-                <w:rFonts w:hint="eastAsia"/>
-                <w:color w:val="000000"/>
-                <w:spacing w:val="2"/>
-                <w:lang w:val="en-US" w:eastAsia="zh-CN"/>
-                <w14:textFill>
-                  <w14:solidFill>
-                    <w14:srgbClr w14:val="000000">
-                      <w14:alpha w14:val="392"/>
-                    </w14:srgbClr>
-                  </w14:solidFill>
-                </w14:textFill>
-              </w:rPr>
-            </w:r>
           </w:p>
         </w:tc>
         <w:tc>
@@ -2795,21 +2534,6 @@
                 </w14:textFill>
               </w:rPr>
             </w:pPr>
-            <w:r>
-              <w:rPr>
-                <w:rFonts w:hint="eastAsia"/>
-                <w:color w:val="000000"/>
-                <w:spacing w:val="2"/>
-                <w:lang w:val="en-US" w:eastAsia="zh-CN"/>
-                <w14:textFill>
-                  <w14:solidFill>
-                    <w14:srgbClr w14:val="000000">
-                      <w14:alpha w14:val="392"/>
-                    </w14:srgbClr>
-                  </w14:solidFill>
-                </w14:textFill>
-              </w:rPr>
-            </w:r>
           </w:p>
         </w:tc>
         <w:tc>
@@ -2837,21 +2561,6 @@
                 </w14:textFill>
               </w:rPr>
             </w:pPr>
-            <w:r>
-              <w:rPr>
-                <w:rFonts w:hint="eastAsia"/>
-                <w:color w:val="000000"/>
-                <w:spacing w:val="2"/>
-                <w:lang w:val="en-US" w:eastAsia="zh-CN"/>
-                <w14:textFill>
-                  <w14:solidFill>
-                    <w14:srgbClr w14:val="000000">
-                      <w14:alpha w14:val="392"/>
-                    </w14:srgbClr>
-                  </w14:solidFill>
-                </w14:textFill>
-              </w:rPr>
-            </w:r>
           </w:p>
         </w:tc>
         <w:tc>
@@ -2879,21 +2588,6 @@
                 </w14:textFill>
               </w:rPr>
             </w:pPr>
-            <w:r>
-              <w:rPr>
-                <w:rFonts w:hint="eastAsia"/>
-                <w:color w:val="000000"/>
-                <w:spacing w:val="2"/>
-                <w:lang w:val="en-US" w:eastAsia="zh-CN"/>
-                <w14:textFill>
-                  <w14:solidFill>
-                    <w14:srgbClr w14:val="000000">
-                      <w14:alpha w14:val="392"/>
-                    </w14:srgbClr>
-                  </w14:solidFill>
-                </w14:textFill>
-              </w:rPr>
-            </w:r>
           </w:p>
         </w:tc>
         <w:tc>
@@ -2921,21 +2615,6 @@
                 </w14:textFill>
               </w:rPr>
             </w:pPr>
-            <w:r>
-              <w:rPr>
-                <w:rFonts w:hint="eastAsia"/>
-                <w:color w:val="000000"/>
-                <w:spacing w:val="2"/>
-                <w:lang w:val="en-US" w:eastAsia="zh-CN"/>
-                <w14:textFill>
-                  <w14:solidFill>
-                    <w14:srgbClr w14:val="000000">
-                      <w14:alpha w14:val="392"/>
-                    </w14:srgbClr>
-                  </w14:solidFill>
-                </w14:textFill>
-              </w:rPr>
-            </w:r>
           </w:p>
         </w:tc>
         <w:tc>
@@ -2963,21 +2642,6 @@
                 </w14:textFill>
               </w:rPr>
             </w:pPr>
-            <w:r>
-              <w:rPr>
-                <w:rFonts w:hint="eastAsia"/>
-                <w:color w:val="000000"/>
-                <w:spacing w:val="2"/>
-                <w:lang w:val="en-US" w:eastAsia="zh-CN"/>
-                <w14:textFill>
-                  <w14:solidFill>
-                    <w14:srgbClr w14:val="000000">
-                      <w14:alpha w14:val="392"/>
-                    </w14:srgbClr>
-                  </w14:solidFill>
-                </w14:textFill>
-              </w:rPr>
-            </w:r>
           </w:p>
         </w:tc>
       </w:tr>
@@ -5478,68 +5142,6 @@
             </w14:solidFill>
           </w14:textFill>
         </w:rPr>
-        <w:drawing>
-          <wp:anchor distT="0" distB="0" distL="114300" distR="114300" simplePos="0" relativeHeight="251659264" behindDoc="1" locked="0" layoutInCell="1" allowOverlap="1">
-            <wp:simplePos x="0" y="0"/>
-            <wp:positionH relativeFrom="column">
-              <wp:posOffset>3021965</wp:posOffset>
-            </wp:positionH>
-            <wp:positionV relativeFrom="paragraph">
-              <wp:posOffset>74295</wp:posOffset>
-            </wp:positionV>
-            <wp:extent cx="2949575" cy="1183640"/>
-            <wp:effectExtent l="0" t="0" r="0" b="0"/>
-            <wp:wrapNone/>
-            <wp:docPr id="1" name="图片 1" descr="英代公章+签字"/>
-            <wp:cNvGraphicFramePr>
-              <a:graphicFrameLocks xmlns:a="http://schemas.openxmlformats.org/drawingml/2006/main" noChangeAspect="1"/>
-            </wp:cNvGraphicFramePr>
-            <a:graphic xmlns:a="http://schemas.openxmlformats.org/drawingml/2006/main">
-              <a:graphicData uri="http://schemas.openxmlformats.org/drawingml/2006/picture">
-                <pic:pic xmlns:pic="http://schemas.openxmlformats.org/drawingml/2006/picture">
-                  <pic:nvPicPr>
-                    <pic:cNvPr id="1" name="图片 1" descr="英代公章+签字"/>
-                    <pic:cNvPicPr>
-                      <a:picLocks noChangeAspect="1"/>
-                    </pic:cNvPicPr>
-                  </pic:nvPicPr>
-                  <pic:blipFill>
-                    <a:blip r:embed="rId7"/>
-                    <a:stretch>
-                      <a:fillRect/>
-                    </a:stretch>
-                  </pic:blipFill>
-                  <pic:spPr>
-                    <a:xfrm rot="21120000">
-                      <a:off x="0" y="0"/>
-                      <a:ext cx="2949575" cy="1183640"/>
-                    </a:xfrm>
-                    <a:prstGeom prst="rect">
-                      <a:avLst/>
-                    </a:prstGeom>
-                  </pic:spPr>
-                </pic:pic>
-              </a:graphicData>
-            </a:graphic>
-          </wp:anchor>
-        </w:drawing>
-      </w:r>
-      <w:r>
-        <w:rPr>
-          <w:rFonts w:hint="eastAsia"/>
-          <w:color w:val="000000"/>
-          <w:spacing w:val="2"/>
-          <w:sz w:val="21"/>
-          <w:szCs w:val="21"/>
-          <w:lang w:val="en-US" w:eastAsia="zh-CN"/>
-          <w14:textFill>
-            <w14:solidFill>
-              <w14:srgbClr w14:val="000000">
-                <w14:alpha w14:val="392"/>
-              </w14:srgbClr>
-            </w14:solidFill>
-          </w14:textFill>
-        </w:rPr>
         <w:t>PARTY A:</w:t>
       </w:r>
       <w:r>
@@ -5557,70 +5159,6 @@
           </w14:textFill>
         </w:rPr>
         <w:t>{{ party_a_name_en }}</w:t>
-      </w:r>
-      <w:r>
-        <w:rPr>
-          <w:rFonts w:hint="eastAsia"/>
-          <w:color w:val="000000"/>
-          <w:spacing w:val="2"/>
-          <w:sz w:val="21"/>
-          <w:szCs w:val="21"/>
-          <w:lang w:val="en-US" w:eastAsia="zh-CN"/>
-          <w14:textFill>
-            <w14:solidFill>
-              <w14:srgbClr w14:val="000000">
-                <w14:alpha w14:val="392"/>
-              </w14:srgbClr>
-            </w14:solidFill>
-          </w14:textFill>
-        </w:rPr>
-      </w:r>
-      <w:r>
-        <w:rPr>
-          <w:color w:val="000000"/>
-          <w:spacing w:val="2"/>
-          <w:sz w:val="21"/>
-          <w:szCs w:val="21"/>
-          <w14:textFill>
-            <w14:solidFill>
-              <w14:srgbClr w14:val="000000">
-                <w14:alpha w14:val="392"/>
-              </w14:srgbClr>
-            </w14:solidFill>
-          </w14:textFill>
-        </w:rPr>
-      </w:r>
-      <w:r>
-        <w:rPr>
-          <w:rFonts w:hint="eastAsia"/>
-          <w:color w:val="000000"/>
-          <w:spacing w:val="2"/>
-          <w:sz w:val="21"/>
-          <w:szCs w:val="21"/>
-          <w:lang w:val="en-US" w:eastAsia="zh-CN"/>
-          <w14:textFill>
-            <w14:solidFill>
-              <w14:srgbClr w14:val="000000">
-                <w14:alpha w14:val="392"/>
-              </w14:srgbClr>
-            </w14:solidFill>
-          </w14:textFill>
-        </w:rPr>
-      </w:r>
-      <w:r>
-        <w:rPr>
-          <w:color w:val="000000"/>
-          <w:spacing w:val="2"/>
-          <w:sz w:val="21"/>
-          <w:szCs w:val="21"/>
-          <w14:textFill>
-            <w14:solidFill>
-              <w14:srgbClr w14:val="000000">
-                <w14:alpha w14:val="392"/>
-              </w14:srgbClr>
-            </w14:solidFill>
-          </w14:textFill>
-        </w:rPr>
       </w:r>
     </w:p>
     <w:p>
@@ -5658,6 +5196,63 @@
           </w14:textFill>
         </w:rPr>
       </w:pPr>
+      <w:r>
+        <w:rPr>
+          <w:rFonts w:hint="eastAsia" w:ascii="宋体" w:hAnsi="宋体" w:eastAsia="宋体" w:cs="宋体"/>
+          <w:snapToGrid w:val="0"/>
+          <w:color w:val="000000"/>
+          <w:spacing w:val="3"/>
+          <w:kern w:val="0"/>
+          <w:sz w:val="19"/>
+          <w:szCs w:val="19"/>
+          <w:lang w:val="en-US" w:eastAsia="zh-CN" w:bidi="ar-SA"/>
+        </w:rPr>
+        <w:drawing>
+          <wp:anchor distT="0" distB="0" distL="114300" distR="114300" simplePos="0" relativeHeight="251659264" behindDoc="1" locked="0" layoutInCell="1" allowOverlap="1">
+            <wp:simplePos x="0" y="0"/>
+            <wp:positionH relativeFrom="column">
+              <wp:posOffset>3041015</wp:posOffset>
+            </wp:positionH>
+            <wp:positionV relativeFrom="paragraph">
+              <wp:posOffset>26670</wp:posOffset>
+            </wp:positionV>
+            <wp:extent cx="2608580" cy="984250"/>
+            <wp:effectExtent l="83820" t="521970" r="101600" b="525780"/>
+            <wp:wrapNone/>
+            <wp:docPr id="2" name="图片 2" descr="logo"/>
+            <wp:cNvGraphicFramePr>
+              <a:graphicFrameLocks xmlns:a="http://schemas.openxmlformats.org/drawingml/2006/main" noChangeAspect="1"/>
+            </wp:cNvGraphicFramePr>
+            <a:graphic xmlns:a="http://schemas.openxmlformats.org/drawingml/2006/main">
+              <a:graphicData uri="http://schemas.openxmlformats.org/drawingml/2006/picture">
+                <pic:pic xmlns:pic="http://schemas.openxmlformats.org/drawingml/2006/picture">
+                  <pic:nvPicPr>
+                    <pic:cNvPr id="2" name="图片 2" descr="logo"/>
+                    <pic:cNvPicPr>
+                      <a:picLocks noChangeAspect="1"/>
+                    </pic:cNvPicPr>
+                  </pic:nvPicPr>
+                  <pic:blipFill>
+                    <a:blip r:embed="rId7"/>
+                    <a:stretch>
+                      <a:fillRect/>
+                    </a:stretch>
+                  </pic:blipFill>
+                  <pic:spPr>
+                    <a:xfrm rot="20040000">
+                      <a:off x="0" y="0"/>
+                      <a:ext cx="2608580" cy="984250"/>
+                    </a:xfrm>
+                    <a:prstGeom prst="rect">
+                      <a:avLst/>
+                    </a:prstGeom>
+                  </pic:spPr>
+                </pic:pic>
+              </a:graphicData>
+            </a:graphic>
+          </wp:anchor>
+        </w:drawing>
+      </w:r>
     </w:p>
     <w:p>
       <w:pPr>
@@ -5890,25 +5485,7 @@
             </w14:solidFill>
           </w14:textFill>
         </w:rPr>
-        <w:t xml:space="preserve">Date (日期): </w:t>
-      </w:r>
-      <w:r>
-        <w:rPr>
-          <w:rFonts w:hint="eastAsia"/>
-          <w:color w:val="000000"/>
-          <w:spacing w:val="2"/>
-          <w:sz w:val="21"/>
-          <w:szCs w:val="21"/>
-          <w:lang w:val="en-US" w:eastAsia="zh-CN"/>
-          <w14:textFill>
-            <w14:solidFill>
-              <w14:srgbClr w14:val="000000">
-                <w14:alpha w14:val="392"/>
-              </w14:srgbClr>
-            </w14:solidFill>
-          </w14:textFill>
-        </w:rPr>
-        <w:t>{{ signing_date }}</w:t>
+        <w:t>Date (日期): {{ signing_date }}</w:t>
       </w:r>
     </w:p>
     <w:p>
@@ -6278,25 +5855,7 @@
             </w14:solidFill>
           </w14:textFill>
         </w:rPr>
-        <w:t>Date (日期):</w:t>
-      </w:r>
-      <w:r>
-        <w:rPr>
-          <w:rFonts w:hint="eastAsia"/>
-          <w:color w:val="000000"/>
-          <w:spacing w:val="2"/>
-          <w:sz w:val="21"/>
-          <w:szCs w:val="21"/>
-          <w:lang w:val="en-US" w:eastAsia="zh-CN"/>
-          <w14:textFill>
-            <w14:solidFill>
-              <w14:srgbClr w14:val="000000">
-                <w14:alpha w14:val="392"/>
-              </w14:srgbClr>
-            </w14:solidFill>
-          </w14:textFill>
-        </w:rPr>
-        <w:t>{{ signing_date }}</w:t>
+        <w:t>Date (日期):{{ signing_date }}</w:t>
       </w:r>
     </w:p>
     <w:p>
@@ -6333,6 +5892,8 @@
       <w:pPr>
         <w:spacing w:line="14" w:lineRule="auto"/>
       </w:pPr>
+      <w:bookmarkStart w:id="0" w:name="_GoBack"/>
+      <w:bookmarkEnd w:id="0"/>
     </w:p>
     <w:sectPr>
       <w:type w:val="continuous"/>

</xml_diff>